<commit_message>
feat: google-generativeai SDK 제거 → REST API 직접 호출 (서버 시작 30초→2초, 메모리 200MB→50MB)
</commit_message>
<xml_diff>
--- a/할일.docx
+++ b/할일.docx
@@ -212,6 +212,66 @@
           <w:numId w:val="1"/>
         </w:numPr>
       </w:pPr>
+      <w:r>
+        <w:rPr>
+          <w:rFonts w:hint="eastAsia"/>
+        </w:rPr>
+        <w:t xml:space="preserve">구글 </w:t>
+      </w:r>
+      <w:proofErr w:type="spellStart"/>
+      <w:r>
+        <w:rPr>
+          <w:rFonts w:hint="eastAsia"/>
+        </w:rPr>
+        <w:t>서치콘솔</w:t>
+      </w:r>
+      <w:proofErr w:type="spellEnd"/>
+      <w:r>
+        <w:rPr>
+          <w:rFonts w:hint="eastAsia"/>
+        </w:rPr>
+        <w:t xml:space="preserve"> 도메인 추가하기</w:t>
+      </w:r>
+    </w:p>
+    <w:p>
+      <w:pPr>
+        <w:pStyle w:val="a6"/>
+        <w:numPr>
+          <w:ilvl w:val="0"/>
+          <w:numId w:val="1"/>
+        </w:numPr>
+      </w:pPr>
+      <w:r>
+        <w:rPr>
+          <w:rFonts w:hint="eastAsia"/>
+        </w:rPr>
+        <w:t xml:space="preserve">구글 </w:t>
+      </w:r>
+      <w:proofErr w:type="spellStart"/>
+      <w:r>
+        <w:rPr>
+          <w:rFonts w:hint="eastAsia"/>
+        </w:rPr>
+        <w:t>애널리틱스</w:t>
+      </w:r>
+      <w:proofErr w:type="spellEnd"/>
+      <w:r>
+        <w:rPr>
+          <w:rFonts w:hint="eastAsia"/>
+        </w:rPr>
+        <w:t xml:space="preserve"> 수정필요 부분 수정하기</w:t>
+      </w:r>
+    </w:p>
+    <w:p/>
+    <w:p>
+      <w:pPr>
+        <w:rPr>
+          <w:rFonts w:hint="eastAsia"/>
+        </w:rPr>
+      </w:pPr>
+      <w:r>
+        <w:t>https://lightsail.aws.amazon.com/ls/webapp/ap-northeast-2/instances/Ubuntu-1/metrics/CpuOverview?timeRange=1h</w:t>
+      </w:r>
     </w:p>
     <w:sectPr>
       <w:pgSz w:w="11906" w:h="16838"/>

</xml_diff>